<commit_message>
Add the Bar-Ilan logo to the title page
The university wordmark replaces the plain "אוניברסיטת בר-אילן" line at the
top of the title page. The logo paragraph carries its own auto line rule so
the image is not clipped by the document's 1.5 line spacing.

Co-Authored-By: Claude Opus 5 <noreply@anthropic.com>
Claude-Session: https://claude.ai/code/session_015DDtNtu4aAzu7Yf2ybC4gC
</commit_message>
<xml_diff>
--- a/essay/מיתוס_ודרמה_עבודה_מסכמת.docx
+++ b/essay/מיתוס_ודרמה_עבודה_מסכמת.docx
@@ -4,29 +4,53 @@
   <w:body>
     <w:p>
       <w:pPr>
-        <w:spacing w:after="600"/>
-      </w:pPr>
-    </w:p>
-    <w:p>
-      <w:pPr>
-        <w:bidi/>
-        <w:spacing w:after="0" w:line="360"/>
+        <w:spacing w:after="360"/>
+      </w:pPr>
+    </w:p>
+    <w:p>
+      <w:pPr>
+        <w:spacing w:after="360" w:line="240" w:lineRule="auto"/>
         <w:jc w:val="center"/>
       </w:pPr>
       <w:r>
-        <w:rPr>
-          <w:rFonts w:ascii="David" w:cs="David" w:eastAsia="David" w:hAnsi="David"/>
-          <w:b w:val="false"/>
-          <w:bCs w:val="false"/>
-          <w:i w:val="false"/>
-          <w:iCs w:val="false"/>
-          <w:noProof/>
-          <w:sz w:val="24"/>
-          <w:szCs w:val="24"/>
-          <w:rtl/>
-          <w:lang w:val="he-IL" w:bidi="he-IL"/>
-        </w:rPr>
-        <w:t xml:space="preserve">אוניברסיטת בר-אילן</w:t>
+        <w:drawing>
+          <wp:inline distT="0" distB="0" distL="0" distR="0">
+            <wp:extent cx="2286000" cy="847725"/>
+            <wp:effectExtent t="0" r="0" b="0" l="0"/>
+            <wp:docPr id="1" name="" descr="" title=""/>
+            <wp:cNvGraphicFramePr>
+              <a:graphicFrameLocks xmlns:a="http://schemas.openxmlformats.org/drawingml/2006/main" noChangeAspect="1"/>
+            </wp:cNvGraphicFramePr>
+            <a:graphic xmlns:a="http://schemas.openxmlformats.org/drawingml/2006/main">
+              <a:graphicData uri="http://schemas.openxmlformats.org/drawingml/2006/picture">
+                <pic:pic xmlns:pic="http://schemas.openxmlformats.org/drawingml/2006/picture">
+                  <pic:nvPicPr>
+                    <pic:cNvPr id="0" name="" descr=""/>
+                    <pic:cNvPicPr>
+                      <a:picLocks noChangeAspect="1" noChangeArrowheads="1"/>
+                    </pic:cNvPicPr>
+                  </pic:nvPicPr>
+                  <pic:blipFill>
+                    <a:blip r:embed="rId8" cstate="none"/>
+                    <a:srcRect/>
+                    <a:stretch>
+                      <a:fillRect/>
+                    </a:stretch>
+                  </pic:blipFill>
+                  <pic:spPr bwMode="auto">
+                    <a:xfrm>
+                      <a:off x="0" y="0"/>
+                      <a:ext cx="2286000" cy="847725"/>
+                    </a:xfrm>
+                    <a:prstGeom prst="rect">
+                      <a:avLst/>
+                    </a:prstGeom>
+                  </pic:spPr>
+                </pic:pic>
+              </a:graphicData>
+            </a:graphic>
+          </wp:inline>
+        </w:drawing>
       </w:r>
     </w:p>
     <w:p>

</xml_diff>